<commit_message>
fix(chem): L06/L07 exit tickets use compounds not shown on the worksheet figure
L06: exit ticket (a) changed from CO2 (visible on molar_masses.png bar chart)
to SO2 (64 g/mol = S:32 + O:2x16), which is absent from both the figure and
the worksheet practice set (H2O, CaCl2, C6H12O6).

L07: exit ticket compound changed from H2O (answers readable off the
water_composition.png pie) to MgO (60% Mg / 40% O, GFM=40 g/mol), which
appears on neither the figure nor the worksheet practice compounds
(CO2, NaCl, NH3, NH4NO3).

Teacher Guide Phase 5 prompts, Student Worksheet exit-ticket tables,
Answer Keys, and NYSSLS checklist rows updated consistently in both lessons.

Co-Authored-By: Claude Opus 4.8 <noreply@anthropic.com>
</commit_message>
<xml_diff>
--- a/Publisher_Ready_Curriculum/02_Chemistry_East_Meadow_Refactor/01_Safety_and_Measurement/06_Gram_Formula_Mass/Answer_Key.docx
+++ b/Publisher_Ready_Curriculum/02_Chemistry_East_Meadow_Refactor/01_Safety_and_Measurement/06_Gram_Formula_Mass/Answer_Key.docx
@@ -859,7 +859,7 @@
           <w:b/>
           <w:bCs/>
         </w:rPr>
-        <w:t xml:space="preserve">(a) GFM of CO₂:</w:t>
+        <w:t xml:space="preserve">(a) GFM of SO₂:</w:t>
       </w:r>
     </w:p>
     <w:tbl>
@@ -931,7 +931,7 @@
               <w:pStyle w:val="Compact"/>
             </w:pPr>
             <w:r>
-              <w:t xml:space="preserve">C</w:t>
+              <w:t xml:space="preserve">S</w:t>
             </w:r>
           </w:p>
         </w:tc>
@@ -942,7 +942,7 @@
               <w:pStyle w:val="Compact"/>
             </w:pPr>
             <w:r>
-              <w:t xml:space="preserve">12.0</w:t>
+              <w:t xml:space="preserve">32.0</w:t>
             </w:r>
           </w:p>
         </w:tc>
@@ -964,7 +964,7 @@
               <w:pStyle w:val="Compact"/>
             </w:pPr>
             <w:r>
-              <w:t xml:space="preserve">12.0</w:t>
+              <w:t xml:space="preserve">32.0</w:t>
             </w:r>
           </w:p>
         </w:tc>
@@ -1058,7 +1058,7 @@
                 <w:b/>
                 <w:bCs/>
               </w:rPr>
-              <w:t xml:space="preserve">44.0 g/mol</w:t>
+              <w:t xml:space="preserve">64.0 g/mol</w:t>
             </w:r>
           </w:p>
         </w:tc>
@@ -1069,7 +1069,7 @@
         <w:pStyle w:val="BodyText"/>
       </w:pPr>
       <w:r>
-        <w:t xml:space="preserve">C contributes 12.0 × 1 = 12.0 g/mol; O contributes 16.0 × 2 = 32.0 g/mol; total = 44.0 g/mol. This matches the bar chart and the CO₂ reference line in</w:t>
+        <w:t xml:space="preserve">S contributes 32.0 × 1 = 32.0 g/mol; O contributes 16.0 × 2 = 32.0 g/mol; total = 64.0 g/mol. SO₂ is not shown on the</w:t>
       </w:r>
       <w:r>
         <w:t xml:space="preserve"> </w:t>
@@ -1081,7 +1081,10 @@
         <w:t xml:space="preserve">molar_masses.png</w:t>
       </w:r>
       <w:r>
-        <w:t xml:space="preserve">.</w:t>
+        <w:t xml:space="preserve"> </w:t>
+      </w:r>
+      <w:r>
+        <w:t xml:space="preserve">bar chart, so students must calculate from the Periodic Table rather than reading the answer from the figure.</w:t>
       </w:r>
     </w:p>
     <w:p>
@@ -1099,13 +1102,13 @@
         <w:t xml:space="preserve"> </w:t>
       </w:r>
       <w:r>
-        <w:t xml:space="preserve">1 point for correct answer (44 g/mol or 44.0 g/mol); 1 point for showing the O × 2 multiplication explicitly in the add-up table. A student who writes</w:t>
+        <w:t xml:space="preserve">1 point for correct answer (64 g/mol or 64.0 g/mol); 1 point for showing the O × 2 multiplication explicitly in the add-up table (S contributes 32, O contributes 32 — both rows required). A student who writes</w:t>
       </w:r>
       <w:r>
         <w:t xml:space="preserve"> </w:t>
       </w:r>
       <w:r>
-        <w:t xml:space="preserve">“C = 12, O = 16, total = 28”</w:t>
+        <w:t xml:space="preserve">“S = 32, O = 16, total = 48”</w:t>
       </w:r>
       <w:r>
         <w:t xml:space="preserve"> </w:t>

</xml_diff>